<commit_message>
Update MC2 D3 documentation
</commit_message>
<xml_diff>
--- a/docs/D3/D3_MC2_BuiTrungTin.docx
+++ b/docs/D3/D3_MC2_BuiTrungTin.docx
@@ -2418,6 +2418,7 @@
           </w:tcPr>
           <w:p>
             <w:pPr>
+              <w:ind w:firstLine="0"/>
               <w:rPr>
                 <w:rFonts w:cs="Times New Roman"/>
               </w:rPr>
@@ -3065,7 +3066,6 @@
           <w:rFonts w:cs="Times New Roman"/>
           <w:b/>
         </w:rPr>
-        <w:lastRenderedPageBreak/>
         <w:t xml:space="preserve">Bằng chứng về worst case: </w:t>
       </w:r>
       <w:r>
@@ -3089,6 +3089,7 @@
           <w:rFonts w:ascii="Times New Roman" w:hAnsi="Times New Roman" w:cs="Times New Roman"/>
           <w:color w:val="auto"/>
         </w:rPr>
+        <w:lastRenderedPageBreak/>
         <w:t>6. Phương án bị loại: Sorted Array</w:t>
       </w:r>
     </w:p>
@@ -3152,7 +3153,35 @@
         <w:rPr>
           <w:rFonts w:cs="Times New Roman"/>
         </w:rPr>
-        <w:t xml:space="preserve">nếu dữ liệu chủ yếu được nạp một lần rồi chỉ đọc/range query, ít cập nhật, Sorted Array có thể phù hợp hơn. Ngược lại, nếu dữ liệu cập nhật nhiều nhưng đến theo thứ tự ngày tăng dần, BST không cân bằng cũng có thể mất lợi thế; khi đó cần benchmark </w:t>
+        <w:t xml:space="preserve">nếu dữ liệu chủ yếu được nạp một lần rồi chỉ đọc/range query, ít cập nhật, Sorted Array có thể phù hợp hơn. Ngược lại, nếu dữ liệu cập nhật nhiều nhưng đến theo thứ tự ngày tăng dần, BST không cân bằng cũng có thể mất lợi thế; khi </w:t>
+      </w:r>
+      <w:proofErr w:type="spellStart"/>
+      <w:r>
+        <w:rPr>
+          <w:rFonts w:cs="Times New Roman"/>
+        </w:rPr>
+        <w:t>đó</w:t>
+      </w:r>
+      <w:proofErr w:type="spellEnd"/>
+      <w:r>
+        <w:rPr>
+          <w:rFonts w:cs="Times New Roman"/>
+        </w:rPr>
+        <w:t xml:space="preserve"> </w:t>
+      </w:r>
+      <w:proofErr w:type="spellStart"/>
+      <w:r>
+        <w:rPr>
+          <w:rFonts w:cs="Times New Roman"/>
+        </w:rPr>
+        <w:t>cần</w:t>
+      </w:r>
+      <w:proofErr w:type="spellEnd"/>
+      <w:r>
+        <w:rPr>
+          <w:rFonts w:cs="Times New Roman"/>
+        </w:rPr>
+        <w:t xml:space="preserve"> benchmark </w:t>
       </w:r>
       <w:proofErr w:type="spellStart"/>
       <w:r>
@@ -3441,14 +3470,7 @@
         <w:rPr>
           <w:rFonts w:cs="Times New Roman"/>
         </w:rPr>
-        <w:t xml:space="preserve">691 checks không phải benchmark hiệu năng. Phần benchmark ở quy mô lớn vẫn phải được nhóm thực hiện theo yêu cầu đồ án. Nếu chưa có mục tiêu quy mô khác </w:t>
-      </w:r>
-      <w:r>
-        <w:rPr>
-          <w:rFonts w:cs="Times New Roman"/>
-        </w:rPr>
-        <w:lastRenderedPageBreak/>
-        <w:t>được giảng viên xác nhận, nhóm cần tối thiểu 10.000 bản ghi giả lập và ít nhất hai mốc quy mô cách nhau một bậc độ lớn; kết quả phải được so sánh với cách tiếp cận tuyến tính trên cùng dữ liệu. Không ghi số liệu thời gian khi chưa thực sự đo.</w:t>
+        <w:t>691 checks không phải benchmark hiệu năng. Phần benchmark ở quy mô lớn vẫn phải được nhóm thực hiện theo yêu cầu đồ án. Nếu chưa có mục tiêu quy mô khác được giảng viên xác nhận, nhóm cần tối thiểu 10.000 bản ghi giả lập và ít nhất hai mốc quy mô cách nhau một bậc độ lớn; kết quả phải được so sánh với cách tiếp cận tuyến tính trên cùng dữ liệu. Không ghi số liệu thời gian khi chưa thực sự đo.</w:t>
       </w:r>
     </w:p>
     <w:p>
@@ -3465,6 +3487,7 @@
           <w:rFonts w:ascii="Times New Roman" w:hAnsi="Times New Roman" w:cs="Times New Roman"/>
           <w:color w:val="auto"/>
         </w:rPr>
+        <w:lastRenderedPageBreak/>
         <w:t>9. Các điểm cần thống nhất khi ghép vào D3 chung</w:t>
       </w:r>
     </w:p>
@@ -3520,7 +3543,49 @@
         <w:rPr>
           <w:rFonts w:cs="Times New Roman"/>
         </w:rPr>
-        <w:t xml:space="preserve">BST hiện không tự lọc trạng thái returned. Nhóm cần chốt MC2 dùng </w:t>
+        <w:t xml:space="preserve">BST </w:t>
+      </w:r>
+      <w:proofErr w:type="spellStart"/>
+      <w:r>
+        <w:rPr>
+          <w:rFonts w:cs="Times New Roman"/>
+        </w:rPr>
+        <w:t>hiện</w:t>
+      </w:r>
+      <w:proofErr w:type="spellEnd"/>
+      <w:r>
+        <w:rPr>
+          <w:rFonts w:cs="Times New Roman"/>
+        </w:rPr>
+        <w:t xml:space="preserve"> không tự lọc trạng thái returned. Nhóm cần </w:t>
+      </w:r>
+      <w:proofErr w:type="spellStart"/>
+      <w:r>
+        <w:rPr>
+          <w:rFonts w:cs="Times New Roman"/>
+        </w:rPr>
+        <w:t>chốt</w:t>
+      </w:r>
+      <w:proofErr w:type="spellEnd"/>
+      <w:r>
+        <w:rPr>
+          <w:rFonts w:cs="Times New Roman"/>
+        </w:rPr>
+        <w:t xml:space="preserve"> MC2 </w:t>
+      </w:r>
+      <w:proofErr w:type="spellStart"/>
+      <w:r>
+        <w:rPr>
+          <w:rFonts w:cs="Times New Roman"/>
+        </w:rPr>
+        <w:t>dùng</w:t>
+      </w:r>
+      <w:proofErr w:type="spellEnd"/>
+      <w:r>
+        <w:rPr>
+          <w:rFonts w:cs="Times New Roman"/>
+        </w:rPr>
+        <w:t xml:space="preserve"> </w:t>
       </w:r>
       <w:proofErr w:type="spellStart"/>
       <w:r>
@@ -3594,7 +3659,77 @@
         <w:rPr>
           <w:rFonts w:cs="Times New Roman"/>
         </w:rPr>
-        <w:t xml:space="preserve"> hay chỉ phục vụ nhắc hạn đối với Loan còn đang mượn; chính sách này nên </w:t>
+        <w:t xml:space="preserve"> hay </w:t>
+      </w:r>
+      <w:proofErr w:type="spellStart"/>
+      <w:r>
+        <w:rPr>
+          <w:rFonts w:cs="Times New Roman"/>
+        </w:rPr>
+        <w:t>chỉ</w:t>
+      </w:r>
+      <w:proofErr w:type="spellEnd"/>
+      <w:r>
+        <w:rPr>
+          <w:rFonts w:cs="Times New Roman"/>
+        </w:rPr>
+        <w:t xml:space="preserve"> </w:t>
+      </w:r>
+      <w:proofErr w:type="spellStart"/>
+      <w:r>
+        <w:rPr>
+          <w:rFonts w:cs="Times New Roman"/>
+        </w:rPr>
+        <w:t>phục</w:t>
+      </w:r>
+      <w:proofErr w:type="spellEnd"/>
+      <w:r>
+        <w:rPr>
+          <w:rFonts w:cs="Times New Roman"/>
+        </w:rPr>
+        <w:t xml:space="preserve"> vụ nhắc hạn đối với Loan còn đang mượn; chính </w:t>
+      </w:r>
+      <w:proofErr w:type="spellStart"/>
+      <w:r>
+        <w:rPr>
+          <w:rFonts w:cs="Times New Roman"/>
+        </w:rPr>
+        <w:t>sách</w:t>
+      </w:r>
+      <w:proofErr w:type="spellEnd"/>
+      <w:r>
+        <w:rPr>
+          <w:rFonts w:cs="Times New Roman"/>
+        </w:rPr>
+        <w:t xml:space="preserve"> </w:t>
+      </w:r>
+      <w:proofErr w:type="spellStart"/>
+      <w:r>
+        <w:rPr>
+          <w:rFonts w:cs="Times New Roman"/>
+        </w:rPr>
+        <w:t>này</w:t>
+      </w:r>
+      <w:proofErr w:type="spellEnd"/>
+      <w:r>
+        <w:rPr>
+          <w:rFonts w:cs="Times New Roman"/>
+        </w:rPr>
+        <w:t xml:space="preserve"> </w:t>
+      </w:r>
+      <w:proofErr w:type="spellStart"/>
+      <w:r>
+        <w:rPr>
+          <w:rFonts w:cs="Times New Roman"/>
+        </w:rPr>
+        <w:t>nên</w:t>
+      </w:r>
+      <w:proofErr w:type="spellEnd"/>
+      <w:r>
+        <w:rPr>
+          <w:rFonts w:cs="Times New Roman"/>
+        </w:rPr>
+        <w:t xml:space="preserve"> </w:t>
       </w:r>
       <w:proofErr w:type="spellStart"/>
       <w:r>
@@ -3743,7 +3878,63 @@
         <w:rPr>
           <w:rFonts w:cs="Times New Roman"/>
         </w:rPr>
-        <w:t xml:space="preserve"> thay đổi, cần cập nhật chỉ mục bằng cách bỏ key cũ và thêm </w:t>
+        <w:t xml:space="preserve"> </w:t>
+      </w:r>
+      <w:proofErr w:type="spellStart"/>
+      <w:r>
+        <w:rPr>
+          <w:rFonts w:cs="Times New Roman"/>
+        </w:rPr>
+        <w:t>thay</w:t>
+      </w:r>
+      <w:proofErr w:type="spellEnd"/>
+      <w:r>
+        <w:rPr>
+          <w:rFonts w:cs="Times New Roman"/>
+        </w:rPr>
+        <w:t xml:space="preserve"> đổi, cần cập nhật chỉ mục bằng cách bỏ key </w:t>
+      </w:r>
+      <w:proofErr w:type="spellStart"/>
+      <w:r>
+        <w:rPr>
+          <w:rFonts w:cs="Times New Roman"/>
+        </w:rPr>
+        <w:t>cũ</w:t>
+      </w:r>
+      <w:proofErr w:type="spellEnd"/>
+      <w:r>
+        <w:rPr>
+          <w:rFonts w:cs="Times New Roman"/>
+        </w:rPr>
+        <w:t xml:space="preserve"> </w:t>
+      </w:r>
+      <w:proofErr w:type="spellStart"/>
+      <w:r>
+        <w:rPr>
+          <w:rFonts w:cs="Times New Roman"/>
+        </w:rPr>
+        <w:t>và</w:t>
+      </w:r>
+      <w:proofErr w:type="spellEnd"/>
+      <w:r>
+        <w:rPr>
+          <w:rFonts w:cs="Times New Roman"/>
+        </w:rPr>
+        <w:t xml:space="preserve"> </w:t>
+      </w:r>
+      <w:proofErr w:type="spellStart"/>
+      <w:r>
+        <w:rPr>
+          <w:rFonts w:cs="Times New Roman"/>
+        </w:rPr>
+        <w:t>thêm</w:t>
+      </w:r>
+      <w:proofErr w:type="spellEnd"/>
+      <w:r>
+        <w:rPr>
+          <w:rFonts w:cs="Times New Roman"/>
+        </w:rPr>
+        <w:t xml:space="preserve"> </w:t>
       </w:r>
       <w:proofErr w:type="spellStart"/>
       <w:r>
@@ -3859,7 +4050,49 @@
         <w:rPr>
           <w:rFonts w:cs="Times New Roman"/>
         </w:rPr>
-        <w:t xml:space="preserve"> đương để giữ đúng thứ tự.</w:t>
+        <w:t xml:space="preserve"> </w:t>
+      </w:r>
+      <w:proofErr w:type="spellStart"/>
+      <w:r>
+        <w:rPr>
+          <w:rFonts w:cs="Times New Roman"/>
+        </w:rPr>
+        <w:t>đương</w:t>
+      </w:r>
+      <w:proofErr w:type="spellEnd"/>
+      <w:r>
+        <w:rPr>
+          <w:rFonts w:cs="Times New Roman"/>
+        </w:rPr>
+        <w:t xml:space="preserve"> </w:t>
+      </w:r>
+      <w:proofErr w:type="spellStart"/>
+      <w:r>
+        <w:rPr>
+          <w:rFonts w:cs="Times New Roman"/>
+        </w:rPr>
+        <w:t>để</w:t>
+      </w:r>
+      <w:proofErr w:type="spellEnd"/>
+      <w:r>
+        <w:rPr>
+          <w:rFonts w:cs="Times New Roman"/>
+        </w:rPr>
+        <w:t xml:space="preserve"> </w:t>
+      </w:r>
+      <w:proofErr w:type="spellStart"/>
+      <w:r>
+        <w:rPr>
+          <w:rFonts w:cs="Times New Roman"/>
+        </w:rPr>
+        <w:t>giữ</w:t>
+      </w:r>
+      <w:proofErr w:type="spellEnd"/>
+      <w:r>
+        <w:rPr>
+          <w:rFonts w:cs="Times New Roman"/>
+        </w:rPr>
+        <w:t xml:space="preserve"> đúng thứ tự.</w:t>
       </w:r>
     </w:p>
     <w:p>
@@ -3914,7 +4147,63 @@
         <w:rPr>
           <w:rFonts w:cs="Times New Roman"/>
         </w:rPr>
-        <w:t xml:space="preserve">Persistence phải chuyển ngày sang dạng có thứ tự đúng trước </w:t>
+        <w:t xml:space="preserve">Persistence </w:t>
+      </w:r>
+      <w:proofErr w:type="spellStart"/>
+      <w:r>
+        <w:rPr>
+          <w:rFonts w:cs="Times New Roman"/>
+        </w:rPr>
+        <w:t>phải</w:t>
+      </w:r>
+      <w:proofErr w:type="spellEnd"/>
+      <w:r>
+        <w:rPr>
+          <w:rFonts w:cs="Times New Roman"/>
+        </w:rPr>
+        <w:t xml:space="preserve"> chuyển ngày sang dạng có thứ </w:t>
+      </w:r>
+      <w:proofErr w:type="spellStart"/>
+      <w:r>
+        <w:rPr>
+          <w:rFonts w:cs="Times New Roman"/>
+        </w:rPr>
+        <w:t>tự</w:t>
+      </w:r>
+      <w:proofErr w:type="spellEnd"/>
+      <w:r>
+        <w:rPr>
+          <w:rFonts w:cs="Times New Roman"/>
+        </w:rPr>
+        <w:t xml:space="preserve"> </w:t>
+      </w:r>
+      <w:proofErr w:type="spellStart"/>
+      <w:r>
+        <w:rPr>
+          <w:rFonts w:cs="Times New Roman"/>
+        </w:rPr>
+        <w:t>đúng</w:t>
+      </w:r>
+      <w:proofErr w:type="spellEnd"/>
+      <w:r>
+        <w:rPr>
+          <w:rFonts w:cs="Times New Roman"/>
+        </w:rPr>
+        <w:t xml:space="preserve"> </w:t>
+      </w:r>
+      <w:proofErr w:type="spellStart"/>
+      <w:r>
+        <w:rPr>
+          <w:rFonts w:cs="Times New Roman"/>
+        </w:rPr>
+        <w:t>trước</w:t>
+      </w:r>
+      <w:proofErr w:type="spellEnd"/>
+      <w:r>
+        <w:rPr>
+          <w:rFonts w:cs="Times New Roman"/>
+        </w:rPr>
+        <w:t xml:space="preserve"> </w:t>
       </w:r>
       <w:proofErr w:type="spellStart"/>
       <w:r>
@@ -4050,7 +4339,35 @@
         <w:rPr>
           <w:rFonts w:cs="Times New Roman"/>
         </w:rPr>
-        <w:t xml:space="preserve"> cộng trực tiếp trên mã YYYYMMDD.</w:t>
+        <w:t xml:space="preserve"> </w:t>
+      </w:r>
+      <w:proofErr w:type="spellStart"/>
+      <w:r>
+        <w:rPr>
+          <w:rFonts w:cs="Times New Roman"/>
+        </w:rPr>
+        <w:t>cộng</w:t>
+      </w:r>
+      <w:proofErr w:type="spellEnd"/>
+      <w:r>
+        <w:rPr>
+          <w:rFonts w:cs="Times New Roman"/>
+        </w:rPr>
+        <w:t xml:space="preserve"> </w:t>
+      </w:r>
+      <w:proofErr w:type="spellStart"/>
+      <w:r>
+        <w:rPr>
+          <w:rFonts w:cs="Times New Roman"/>
+        </w:rPr>
+        <w:t>trực</w:t>
+      </w:r>
+      <w:proofErr w:type="spellEnd"/>
+      <w:r>
+        <w:rPr>
+          <w:rFonts w:cs="Times New Roman"/>
+        </w:rPr>
+        <w:t xml:space="preserve"> tiếp trên mã YYYYMMDD.</w:t>
       </w:r>
     </w:p>
     <w:p>
@@ -4095,7 +4412,49 @@
         <w:rPr>
           <w:rFonts w:cs="Times New Roman"/>
         </w:rPr>
-        <w:t xml:space="preserve"> sung số liệu thực nghiệm trước bản nộp cuối; test chức </w:t>
+        <w:t xml:space="preserve"> sung </w:t>
+      </w:r>
+      <w:proofErr w:type="spellStart"/>
+      <w:r>
+        <w:rPr>
+          <w:rFonts w:cs="Times New Roman"/>
+        </w:rPr>
+        <w:t>số</w:t>
+      </w:r>
+      <w:proofErr w:type="spellEnd"/>
+      <w:r>
+        <w:rPr>
+          <w:rFonts w:cs="Times New Roman"/>
+        </w:rPr>
+        <w:t xml:space="preserve"> liệu thực nghiệm trước bản nộp </w:t>
+      </w:r>
+      <w:proofErr w:type="spellStart"/>
+      <w:r>
+        <w:rPr>
+          <w:rFonts w:cs="Times New Roman"/>
+        </w:rPr>
+        <w:t>cuối</w:t>
+      </w:r>
+      <w:proofErr w:type="spellEnd"/>
+      <w:r>
+        <w:rPr>
+          <w:rFonts w:cs="Times New Roman"/>
+        </w:rPr>
+        <w:t xml:space="preserve">; test </w:t>
+      </w:r>
+      <w:proofErr w:type="spellStart"/>
+      <w:r>
+        <w:rPr>
+          <w:rFonts w:cs="Times New Roman"/>
+        </w:rPr>
+        <w:t>chức</w:t>
+      </w:r>
+      <w:proofErr w:type="spellEnd"/>
+      <w:r>
+        <w:rPr>
+          <w:rFonts w:cs="Times New Roman"/>
+        </w:rPr>
+        <w:t xml:space="preserve"> </w:t>
       </w:r>
       <w:proofErr w:type="spellStart"/>
       <w:r>

</xml_diff>